<commit_message>
feat(candidat): l'espace Candidat presente les DEUX epreuves
Le tableau de bord /candidat n'affichait que les tests psychotechniques.
Il presente desormais « Mes deux epreuves » en tuiles symetriques :

- 🧠 Tests psychotechniques : nombre de tests termines, « Ouvrir le
  module », acces direct « Passer un test » ; la progression par categorie
  (6 cartes) reste affichee en dessous.
- ⚖️ Statut general de la Fonction Publique : tests passes, maitrise
  globale (n/116 articles), XP/niveau/serie, meilleure simulation,
  articles a reviser — avec « Ouvrir le module », 🎮 Jeux et 🗺️ Ma carte.

Actions generales regroupees (resultats toutes epreuves, parrainage,
guide). Guide Candidat mis a jour et regenere.

Verification : acces aux deux modules confirme en production (200) ;
6/6 controles sur le nouveau tableau de bord.

Co-Authored-By: Claude Opus 4.8 (1M context) <noreply@anthropic.com>
</commit_message>
<xml_diff>
--- a/guides/Guide-Candidat-EduWeb.docx
+++ b/guides/Guide-Candidat-EduWeb.docx
@@ -109,7 +109,7 @@
           <w:sz w:val="16"/>
           <w:szCs w:val="16"/>
         </w:rPr>
-        <w:t xml:space="preserve">family.eduweb.ci · Version du 13 août 2026</w:t>
+        <w:t xml:space="preserve">family.eduweb.ci · Version du 15 août 2026</w:t>
       </w:r>
     </w:p>
     <w:p>
@@ -723,7 +723,7 @@
           <w:sz w:val="22"/>
           <w:szCs w:val="22"/>
         </w:rPr>
-        <w:t xml:space="preserve">Votre espace Candidat rassemble tout : votre statut d'accès, les boutons « Passer un test », « Théorie &amp; astuces », « Mes résultats », votre progression par catégorie et vos derniers tests.</w:t>
+        <w:t xml:space="preserve">Votre espace Candidat présente VOS DEUX ÉPREUVES côte à côte : les Tests psychotechniques (avec votre progression par catégorie) et le Statut général de la Fonction Publique (maîtrise des articles, XP, articles à réviser, jeux, carte). Chaque épreuve a son bouton « Ouvrir le module » ; votre statut d'accès et vos derniers tests sont affichés en dessous.</w:t>
       </w:r>
     </w:p>
     <w:p>

</xml_diff>

<commit_message>
fix(candidat): espace symetrique — resumes compacts par epreuve
La grille « Ma progression — Tests psychotechniques » quittait l'espace
Candidat (elle vit deja dans le module /formation/psychotechniques,
comme la carte de maitrise vit dans le module Fonction Publique).

En echange, la tuile Tests psychotechniques recoit un RESUME compact
symetrique de celui de la Fonction Publique : tests passes, categories
travaillees (n/6), meilleur score en conditions de concours — avec la
mention « progression detaillee dans le module ». Sous-titre de la page
generalise (« les deux epreuves en un coup d'oeil »). Guide Candidat
mis a jour et regenere.

6/6 controles locaux.

Co-Authored-By: Claude Opus 4.8 (1M context) <noreply@anthropic.com>
</commit_message>
<xml_diff>
--- a/guides/Guide-Candidat-EduWeb.docx
+++ b/guides/Guide-Candidat-EduWeb.docx
@@ -109,7 +109,7 @@
           <w:sz w:val="16"/>
           <w:szCs w:val="16"/>
         </w:rPr>
-        <w:t xml:space="preserve">family.eduweb.ci · Version du 15 août 2026</w:t>
+        <w:t xml:space="preserve">family.eduweb.ci · Version du 16 août 2026</w:t>
       </w:r>
     </w:p>
     <w:p>
@@ -723,7 +723,7 @@
           <w:sz w:val="22"/>
           <w:szCs w:val="22"/>
         </w:rPr>
-        <w:t xml:space="preserve">Votre espace Candidat présente VOS DEUX ÉPREUVES côte à côte : les Tests psychotechniques (avec votre progression par catégorie) et le Statut général de la Fonction Publique (maîtrise des articles, XP, articles à réviser, jeux, carte). Chaque épreuve a son bouton « Ouvrir le module » ; votre statut d'accès et vos derniers tests sont affichés en dessous.</w:t>
+        <w:t xml:space="preserve">Votre espace Candidat présente VOS DEUX ÉPREUVES côte à côte, chacune avec son résumé : Tests psychotechniques (tests passés, catégories travaillées, meilleur score en conditions de concours) et Statut général de la Fonction Publique (maîtrise des articles, XP, articles à réviser). Chaque épreuve a son bouton « Ouvrir le module » — c'est LÀ que se trouve la progression détaillée (par catégorie, ou carte des 116 articles). Votre statut d'accès et vos derniers tests sont affichés sur l'espace.</w:t>
       </w:r>
     </w:p>
     <w:p>

</xml_diff>

<commit_message>
fix(paiements): retrait de MTN MoMo + numeros par operateur
Paiements VERS EduWeb (Formation, librairie, dons) :
- MTN MoMo retire de la liste des operateurs (config + les 3 formulaires
  + page d'accueil en 12 langues + guides) ; toute declaration 'mtn' est
  refusee cote serveur
- Numeros precises partout : Wave ou Moov Money au (+225) 01 5263 3030,
  Orange Money au (+225) 07 0985 8042 ; la confirmation de commande
  affiche le numero de L'OPERATEUR choisi (APP.numeroOperateur)
- Les versements SORTANTS (retrocessions vers le numero du parrain)
  gardent MTN : il s'agit du numero de reception du beneficiaire
- 6 guides regeneres · verifie 12/12 (affichages, refus mtn, numero
  par operateur sur la confirmation)

Co-Authored-By: Claude Fable 5 <noreply@anthropic.com>
</commit_message>
<xml_diff>
--- a/guides/Guide-Candidat-EduWeb.docx
+++ b/guides/Guide-Candidat-EduWeb.docx
@@ -109,7 +109,7 @@
           <w:sz w:val="16"/>
           <w:szCs w:val="16"/>
         </w:rPr>
-        <w:t xml:space="preserve">family.eduweb.ci · Version du 6 septembre 2026</w:t>
+        <w:t xml:space="preserve">family.eduweb.ci · Version du 7 septembre 2026</w:t>
       </w:r>
     </w:p>
     <w:p>
@@ -1165,7 +1165,7 @@
           <w:sz w:val="22"/>
           <w:szCs w:val="22"/>
         </w:rPr>
-        <w:t xml:space="preserve">PAYER UNE FORMULE : choisissez une formule (prix, durée et nombre de tests affichés), envoyez le montant par Mobile Money (Wave, Orange Money, MTN MoMo ou Moov Money) au numéro EduWeb indiqué à l'écran, PUIS déclarez votre versement dans le formulaire : opérateur utilisé + référence (l'identifiant reçu par SMS après votre transfert).</w:t>
+        <w:t xml:space="preserve">PAYER UNE FORMULE : choisissez une formule (prix, durée et nombre de tests affichés), envoyez le montant par Mobile Money — Wave ou Moov Money au (+225) 01 5263 3030, Orange Money au (+225) 07 0985 8042 —, PUIS déclarez votre versement dans le formulaire : opérateur utilisé + référence (l'identifiant reçu par SMS après votre transfert).</w:t>
       </w:r>
     </w:p>
     <w:p>

</xml_diff>